<commit_message>
relecture avec Fable 5
</commit_message>
<xml_diff>
--- a/star-wars/scenarios/birth-of-the-death-squadron/docs/enigmes_signal_detresse.docx
+++ b/star-wars/scenarios/birth-of-the-death-squadron/docs/enigmes_signal_detresse.docx
@@ -1032,685 +1032,21 @@
         <w:t xml:space="preserve">La légende — carré de Polybe à mot-clé LOTUS</w:t>
       </w:r>
     </w:p>
-    <w:tbl>
-      <w:tblPr>
-        <w:tblW w:type="dxa" w:w="4000"/>
-        <w:tblBorders>
-          <w:top w:val="single" w:color="auto" w:sz="4"/>
-          <w:left w:val="single" w:color="auto" w:sz="4"/>
-          <w:bottom w:val="single" w:color="auto" w:sz="4"/>
-          <w:right w:val="single" w:color="auto" w:sz="4"/>
-          <w:insideH w:val="single" w:color="auto" w:sz="4"/>
-          <w:insideV w:val="single" w:color="auto" w:sz="4"/>
-        </w:tblBorders>
-      </w:tblPr>
-      <w:tblGrid>
-        <w:gridCol w:w="500"/>
-        <w:gridCol w:w="700"/>
-        <w:gridCol w:w="700"/>
-        <w:gridCol w:w="700"/>
-        <w:gridCol w:w="700"/>
-        <w:gridCol w:w="700"/>
-      </w:tblGrid>
-      <w:tr>
-        <w:tc>
-          <w:tcPr>
-            <w:tcW w:type="dxa" w:w="500"/>
-            <w:tcBorders>
-              <w:top w:val="single" w:color="999999" w:sz="2"/>
-              <w:left w:val="single" w:color="999999" w:sz="2"/>
-              <w:bottom w:val="single" w:color="999999" w:sz="2"/>
-              <w:right w:val="single" w:color="999999" w:sz="2"/>
-            </w:tcBorders>
-            <w:shd w:fill="E0DDEF" w:val="clear"/>
-          </w:tcPr>
-          <w:p>
-            <w:r>
-              <w:rPr>
-                <w:rFonts w:ascii="Calibri" w:cs="Calibri" w:eastAsia="Calibri" w:hAnsi="Calibri"/>
-                <w:b/>
-                <w:bCs/>
-                <w:sz w:val="18"/>
-                <w:szCs w:val="18"/>
-              </w:rPr>
-              <w:t xml:space="preserve"/>
-            </w:r>
-          </w:p>
-        </w:tc>
-        <w:tc>
-          <w:tcPr>
-            <w:tcW w:type="dxa" w:w="700"/>
-            <w:tcBorders>
-              <w:top w:val="single" w:color="999999" w:sz="2"/>
-              <w:left w:val="single" w:color="999999" w:sz="2"/>
-              <w:bottom w:val="single" w:color="999999" w:sz="2"/>
-              <w:right w:val="single" w:color="999999" w:sz="2"/>
-            </w:tcBorders>
-            <w:shd w:fill="E0DDEF" w:val="clear"/>
-          </w:tcPr>
-          <w:p>
-            <w:r>
-              <w:rPr>
-                <w:rFonts w:ascii="Calibri" w:cs="Calibri" w:eastAsia="Calibri" w:hAnsi="Calibri"/>
-                <w:b/>
-                <w:bCs/>
-                <w:sz w:val="18"/>
-                <w:szCs w:val="18"/>
-              </w:rPr>
-              <w:t xml:space="preserve">col 1</w:t>
-            </w:r>
-          </w:p>
-        </w:tc>
-        <w:tc>
-          <w:tcPr>
-            <w:tcW w:type="dxa" w:w="700"/>
-            <w:tcBorders>
-              <w:top w:val="single" w:color="999999" w:sz="2"/>
-              <w:left w:val="single" w:color="999999" w:sz="2"/>
-              <w:bottom w:val="single" w:color="999999" w:sz="2"/>
-              <w:right w:val="single" w:color="999999" w:sz="2"/>
-            </w:tcBorders>
-            <w:shd w:fill="E0DDEF" w:val="clear"/>
-          </w:tcPr>
-          <w:p>
-            <w:r>
-              <w:rPr>
-                <w:rFonts w:ascii="Calibri" w:cs="Calibri" w:eastAsia="Calibri" w:hAnsi="Calibri"/>
-                <w:b/>
-                <w:bCs/>
-                <w:sz w:val="18"/>
-                <w:szCs w:val="18"/>
-              </w:rPr>
-              <w:t xml:space="preserve">col 2</w:t>
-            </w:r>
-          </w:p>
-        </w:tc>
-        <w:tc>
-          <w:tcPr>
-            <w:tcW w:type="dxa" w:w="700"/>
-            <w:tcBorders>
-              <w:top w:val="single" w:color="999999" w:sz="2"/>
-              <w:left w:val="single" w:color="999999" w:sz="2"/>
-              <w:bottom w:val="single" w:color="999999" w:sz="2"/>
-              <w:right w:val="single" w:color="999999" w:sz="2"/>
-            </w:tcBorders>
-            <w:shd w:fill="E0DDEF" w:val="clear"/>
-          </w:tcPr>
-          <w:p>
-            <w:r>
-              <w:rPr>
-                <w:rFonts w:ascii="Calibri" w:cs="Calibri" w:eastAsia="Calibri" w:hAnsi="Calibri"/>
-                <w:b/>
-                <w:bCs/>
-                <w:sz w:val="18"/>
-                <w:szCs w:val="18"/>
-              </w:rPr>
-              <w:t xml:space="preserve">col 3</w:t>
-            </w:r>
-          </w:p>
-        </w:tc>
-        <w:tc>
-          <w:tcPr>
-            <w:tcW w:type="dxa" w:w="700"/>
-            <w:tcBorders>
-              <w:top w:val="single" w:color="999999" w:sz="2"/>
-              <w:left w:val="single" w:color="999999" w:sz="2"/>
-              <w:bottom w:val="single" w:color="999999" w:sz="2"/>
-              <w:right w:val="single" w:color="999999" w:sz="2"/>
-            </w:tcBorders>
-            <w:shd w:fill="E0DDEF" w:val="clear"/>
-          </w:tcPr>
-          <w:p>
-            <w:r>
-              <w:rPr>
-                <w:rFonts w:ascii="Calibri" w:cs="Calibri" w:eastAsia="Calibri" w:hAnsi="Calibri"/>
-                <w:b/>
-                <w:bCs/>
-                <w:sz w:val="18"/>
-                <w:szCs w:val="18"/>
-              </w:rPr>
-              <w:t xml:space="preserve">col 4</w:t>
-            </w:r>
-          </w:p>
-        </w:tc>
-        <w:tc>
-          <w:tcPr>
-            <w:tcW w:type="dxa" w:w="700"/>
-            <w:tcBorders>
-              <w:top w:val="single" w:color="999999" w:sz="2"/>
-              <w:left w:val="single" w:color="999999" w:sz="2"/>
-              <w:bottom w:val="single" w:color="999999" w:sz="2"/>
-              <w:right w:val="single" w:color="999999" w:sz="2"/>
-            </w:tcBorders>
-            <w:shd w:fill="E0DDEF" w:val="clear"/>
-          </w:tcPr>
-          <w:p>
-            <w:r>
-              <w:rPr>
-                <w:rFonts w:ascii="Calibri" w:cs="Calibri" w:eastAsia="Calibri" w:hAnsi="Calibri"/>
-                <w:b/>
-                <w:bCs/>
-                <w:sz w:val="18"/>
-                <w:szCs w:val="18"/>
-              </w:rPr>
-              <w:t xml:space="preserve">col 5</w:t>
-            </w:r>
-          </w:p>
-        </w:tc>
-      </w:tr>
-      <w:tr>
-        <w:tc>
-          <w:tcPr>
-            <w:tcW w:type="dxa" w:w="500"/>
-            <w:tcBorders>
-              <w:top w:val="single" w:color="999999" w:sz="2"/>
-              <w:left w:val="single" w:color="999999" w:sz="2"/>
-              <w:bottom w:val="single" w:color="999999" w:sz="2"/>
-              <w:right w:val="single" w:color="999999" w:sz="2"/>
-            </w:tcBorders>
-          </w:tcPr>
-          <w:p>
-            <w:r>
-              <w:rPr>
-                <w:rFonts w:ascii="Calibri" w:cs="Calibri" w:eastAsia="Calibri" w:hAnsi="Calibri"/>
-                <w:sz w:val="17"/>
-                <w:szCs w:val="17"/>
-              </w:rPr>
-              <w:t xml:space="preserve">rang 1</w:t>
-            </w:r>
-          </w:p>
-        </w:tc>
-        <w:tc>
-          <w:tcPr>
-            <w:tcW w:type="dxa" w:w="700"/>
-            <w:tcBorders>
-              <w:top w:val="single" w:color="999999" w:sz="2"/>
-              <w:left w:val="single" w:color="999999" w:sz="2"/>
-              <w:bottom w:val="single" w:color="999999" w:sz="2"/>
-              <w:right w:val="single" w:color="999999" w:sz="2"/>
-            </w:tcBorders>
-          </w:tcPr>
-          <w:p>
-            <w:r>
-              <w:rPr>
-                <w:rFonts w:ascii="Calibri" w:cs="Calibri" w:eastAsia="Calibri" w:hAnsi="Calibri"/>
-                <w:sz w:val="17"/>
-                <w:szCs w:val="17"/>
-              </w:rPr>
-              <w:t xml:space="preserve">L</w:t>
-            </w:r>
-          </w:p>
-        </w:tc>
-        <w:tc>
-          <w:tcPr>
-            <w:tcW w:type="dxa" w:w="700"/>
-            <w:tcBorders>
-              <w:top w:val="single" w:color="999999" w:sz="2"/>
-              <w:left w:val="single" w:color="999999" w:sz="2"/>
-              <w:bottom w:val="single" w:color="999999" w:sz="2"/>
-              <w:right w:val="single" w:color="999999" w:sz="2"/>
-            </w:tcBorders>
-          </w:tcPr>
-          <w:p>
-            <w:r>
-              <w:rPr>
-                <w:rFonts w:ascii="Calibri" w:cs="Calibri" w:eastAsia="Calibri" w:hAnsi="Calibri"/>
-                <w:sz w:val="17"/>
-                <w:szCs w:val="17"/>
-              </w:rPr>
-              <w:t xml:space="preserve">O</w:t>
-            </w:r>
-          </w:p>
-        </w:tc>
-        <w:tc>
-          <w:tcPr>
-            <w:tcW w:type="dxa" w:w="700"/>
-            <w:tcBorders>
-              <w:top w:val="single" w:color="999999" w:sz="2"/>
-              <w:left w:val="single" w:color="999999" w:sz="2"/>
-              <w:bottom w:val="single" w:color="999999" w:sz="2"/>
-              <w:right w:val="single" w:color="999999" w:sz="2"/>
-            </w:tcBorders>
-          </w:tcPr>
-          <w:p>
-            <w:r>
-              <w:rPr>
-                <w:rFonts w:ascii="Calibri" w:cs="Calibri" w:eastAsia="Calibri" w:hAnsi="Calibri"/>
-                <w:sz w:val="17"/>
-                <w:szCs w:val="17"/>
-              </w:rPr>
-              <w:t xml:space="preserve">T</w:t>
-            </w:r>
-          </w:p>
-        </w:tc>
-        <w:tc>
-          <w:tcPr>
-            <w:tcW w:type="dxa" w:w="700"/>
-            <w:tcBorders>
-              <w:top w:val="single" w:color="999999" w:sz="2"/>
-              <w:left w:val="single" w:color="999999" w:sz="2"/>
-              <w:bottom w:val="single" w:color="999999" w:sz="2"/>
-              <w:right w:val="single" w:color="999999" w:sz="2"/>
-            </w:tcBorders>
-          </w:tcPr>
-          <w:p>
-            <w:r>
-              <w:rPr>
-                <w:rFonts w:ascii="Calibri" w:cs="Calibri" w:eastAsia="Calibri" w:hAnsi="Calibri"/>
-                <w:sz w:val="17"/>
-                <w:szCs w:val="17"/>
-              </w:rPr>
-              <w:t xml:space="preserve">U</w:t>
-            </w:r>
-          </w:p>
-        </w:tc>
-        <w:tc>
-          <w:tcPr>
-            <w:tcW w:type="dxa" w:w="700"/>
-            <w:tcBorders>
-              <w:top w:val="single" w:color="999999" w:sz="2"/>
-              <w:left w:val="single" w:color="999999" w:sz="2"/>
-              <w:bottom w:val="single" w:color="999999" w:sz="2"/>
-              <w:right w:val="single" w:color="999999" w:sz="2"/>
-            </w:tcBorders>
-          </w:tcPr>
-          <w:p>
-            <w:r>
-              <w:rPr>
-                <w:rFonts w:ascii="Calibri" w:cs="Calibri" w:eastAsia="Calibri" w:hAnsi="Calibri"/>
-                <w:sz w:val="17"/>
-                <w:szCs w:val="17"/>
-              </w:rPr>
-              <w:t xml:space="preserve">S</w:t>
-            </w:r>
-          </w:p>
-        </w:tc>
-      </w:tr>
-      <w:tr>
-        <w:tc>
-          <w:tcPr>
-            <w:tcW w:type="dxa" w:w="500"/>
-            <w:tcBorders>
-              <w:top w:val="single" w:color="999999" w:sz="2"/>
-              <w:left w:val="single" w:color="999999" w:sz="2"/>
-              <w:bottom w:val="single" w:color="999999" w:sz="2"/>
-              <w:right w:val="single" w:color="999999" w:sz="2"/>
-            </w:tcBorders>
-          </w:tcPr>
-          <w:p>
-            <w:r>
-              <w:rPr>
-                <w:rFonts w:ascii="Calibri" w:cs="Calibri" w:eastAsia="Calibri" w:hAnsi="Calibri"/>
-                <w:sz w:val="17"/>
-                <w:szCs w:val="17"/>
-              </w:rPr>
-              <w:t xml:space="preserve">rang 2</w:t>
-            </w:r>
-          </w:p>
-        </w:tc>
-        <w:tc>
-          <w:tcPr>
-            <w:tcW w:type="dxa" w:w="700"/>
-            <w:tcBorders>
-              <w:top w:val="single" w:color="999999" w:sz="2"/>
-              <w:left w:val="single" w:color="999999" w:sz="2"/>
-              <w:bottom w:val="single" w:color="999999" w:sz="2"/>
-              <w:right w:val="single" w:color="999999" w:sz="2"/>
-            </w:tcBorders>
-          </w:tcPr>
-          <w:p>
-            <w:r>
-              <w:rPr>
-                <w:rFonts w:ascii="Calibri" w:cs="Calibri" w:eastAsia="Calibri" w:hAnsi="Calibri"/>
-                <w:sz w:val="17"/>
-                <w:szCs w:val="17"/>
-              </w:rPr>
-              <w:t xml:space="preserve">A</w:t>
-            </w:r>
-          </w:p>
-        </w:tc>
-        <w:tc>
-          <w:tcPr>
-            <w:tcW w:type="dxa" w:w="700"/>
-            <w:tcBorders>
-              <w:top w:val="single" w:color="999999" w:sz="2"/>
-              <w:left w:val="single" w:color="999999" w:sz="2"/>
-              <w:bottom w:val="single" w:color="999999" w:sz="2"/>
-              <w:right w:val="single" w:color="999999" w:sz="2"/>
-            </w:tcBorders>
-          </w:tcPr>
-          <w:p>
-            <w:r>
-              <w:rPr>
-                <w:rFonts w:ascii="Calibri" w:cs="Calibri" w:eastAsia="Calibri" w:hAnsi="Calibri"/>
-                <w:sz w:val="17"/>
-                <w:szCs w:val="17"/>
-              </w:rPr>
-              <w:t xml:space="preserve">B</w:t>
-            </w:r>
-          </w:p>
-        </w:tc>
-        <w:tc>
-          <w:tcPr>
-            <w:tcW w:type="dxa" w:w="700"/>
-            <w:tcBorders>
-              <w:top w:val="single" w:color="999999" w:sz="2"/>
-              <w:left w:val="single" w:color="999999" w:sz="2"/>
-              <w:bottom w:val="single" w:color="999999" w:sz="2"/>
-              <w:right w:val="single" w:color="999999" w:sz="2"/>
-            </w:tcBorders>
-          </w:tcPr>
-          <w:p>
-            <w:r>
-              <w:rPr>
-                <w:rFonts w:ascii="Calibri" w:cs="Calibri" w:eastAsia="Calibri" w:hAnsi="Calibri"/>
-                <w:sz w:val="17"/>
-                <w:szCs w:val="17"/>
-              </w:rPr>
-              <w:t xml:space="preserve">C</w:t>
-            </w:r>
-          </w:p>
-        </w:tc>
-        <w:tc>
-          <w:tcPr>
-            <w:tcW w:type="dxa" w:w="700"/>
-            <w:tcBorders>
-              <w:top w:val="single" w:color="999999" w:sz="2"/>
-              <w:left w:val="single" w:color="999999" w:sz="2"/>
-              <w:bottom w:val="single" w:color="999999" w:sz="2"/>
-              <w:right w:val="single" w:color="999999" w:sz="2"/>
-            </w:tcBorders>
-          </w:tcPr>
-          <w:p>
-            <w:r>
-              <w:rPr>
-                <w:rFonts w:ascii="Calibri" w:cs="Calibri" w:eastAsia="Calibri" w:hAnsi="Calibri"/>
-                <w:sz w:val="17"/>
-                <w:szCs w:val="17"/>
-              </w:rPr>
-              <w:t xml:space="preserve">D</w:t>
-            </w:r>
-          </w:p>
-        </w:tc>
-        <w:tc>
-          <w:tcPr>
-            <w:tcW w:type="dxa" w:w="700"/>
-            <w:tcBorders>
-              <w:top w:val="single" w:color="999999" w:sz="2"/>
-              <w:left w:val="single" w:color="999999" w:sz="2"/>
-              <w:bottom w:val="single" w:color="999999" w:sz="2"/>
-              <w:right w:val="single" w:color="999999" w:sz="2"/>
-            </w:tcBorders>
-          </w:tcPr>
-          <w:p>
-            <w:r>
-              <w:rPr>
-                <w:rFonts w:ascii="Calibri" w:cs="Calibri" w:eastAsia="Calibri" w:hAnsi="Calibri"/>
-                <w:sz w:val="17"/>
-                <w:szCs w:val="17"/>
-              </w:rPr>
-              <w:t xml:space="preserve">E</w:t>
-            </w:r>
-          </w:p>
-        </w:tc>
-      </w:tr>
-      <w:tr>
-        <w:tc>
-          <w:tcPr>
-            <w:tcW w:type="dxa" w:w="500"/>
-            <w:tcBorders>
-              <w:top w:val="single" w:color="999999" w:sz="2"/>
-              <w:left w:val="single" w:color="999999" w:sz="2"/>
-              <w:bottom w:val="single" w:color="999999" w:sz="2"/>
-              <w:right w:val="single" w:color="999999" w:sz="2"/>
-            </w:tcBorders>
-          </w:tcPr>
-          <w:p>
-            <w:r>
-              <w:rPr>
-                <w:rFonts w:ascii="Calibri" w:cs="Calibri" w:eastAsia="Calibri" w:hAnsi="Calibri"/>
-                <w:sz w:val="17"/>
-                <w:szCs w:val="17"/>
-              </w:rPr>
-              <w:t xml:space="preserve">rang 3</w:t>
-            </w:r>
-          </w:p>
-        </w:tc>
-        <w:tc>
-          <w:tcPr>
-            <w:tcW w:type="dxa" w:w="700"/>
-            <w:tcBorders>
-              <w:top w:val="single" w:color="999999" w:sz="2"/>
-              <w:left w:val="single" w:color="999999" w:sz="2"/>
-              <w:bottom w:val="single" w:color="999999" w:sz="2"/>
-              <w:right w:val="single" w:color="999999" w:sz="2"/>
-            </w:tcBorders>
-          </w:tcPr>
-          <w:p>
-            <w:r>
-              <w:rPr>
-                <w:rFonts w:ascii="Calibri" w:cs="Calibri" w:eastAsia="Calibri" w:hAnsi="Calibri"/>
-                <w:sz w:val="17"/>
-                <w:szCs w:val="17"/>
-              </w:rPr>
-              <w:t xml:space="preserve">F</w:t>
-            </w:r>
-          </w:p>
-        </w:tc>
-        <w:tc>
-          <w:tcPr>
-            <w:tcW w:type="dxa" w:w="700"/>
-            <w:tcBorders>
-              <w:top w:val="single" w:color="999999" w:sz="2"/>
-              <w:left w:val="single" w:color="999999" w:sz="2"/>
-              <w:bottom w:val="single" w:color="999999" w:sz="2"/>
-              <w:right w:val="single" w:color="999999" w:sz="2"/>
-            </w:tcBorders>
-          </w:tcPr>
-          <w:p>
-            <w:r>
-              <w:rPr>
-                <w:rFonts w:ascii="Calibri" w:cs="Calibri" w:eastAsia="Calibri" w:hAnsi="Calibri"/>
-                <w:sz w:val="17"/>
-                <w:szCs w:val="17"/>
-              </w:rPr>
-              <w:t xml:space="preserve">G</w:t>
-            </w:r>
-          </w:p>
-        </w:tc>
-        <w:tc>
-          <w:tcPr>
-            <w:tcW w:type="dxa" w:w="700"/>
-            <w:tcBorders>
-              <w:top w:val="single" w:color="999999" w:sz="2"/>
-              <w:left w:val="single" w:color="999999" w:sz="2"/>
-              <w:bottom w:val="single" w:color="999999" w:sz="2"/>
-              <w:right w:val="single" w:color="999999" w:sz="2"/>
-            </w:tcBorders>
-          </w:tcPr>
-          <w:p>
-            <w:r>
-              <w:rPr>
-                <w:rFonts w:ascii="Calibri" w:cs="Calibri" w:eastAsia="Calibri" w:hAnsi="Calibri"/>
-                <w:sz w:val="17"/>
-                <w:szCs w:val="17"/>
-              </w:rPr>
-              <w:t xml:space="preserve">H</w:t>
-            </w:r>
-          </w:p>
-        </w:tc>
-        <w:tc>
-          <w:tcPr>
-            <w:tcW w:type="dxa" w:w="700"/>
-            <w:tcBorders>
-              <w:top w:val="single" w:color="999999" w:sz="2"/>
-              <w:left w:val="single" w:color="999999" w:sz="2"/>
-              <w:bottom w:val="single" w:color="999999" w:sz="2"/>
-              <w:right w:val="single" w:color="999999" w:sz="2"/>
-            </w:tcBorders>
-          </w:tcPr>
-          <w:p>
-            <w:r>
-              <w:rPr>
-                <w:rFonts w:ascii="Calibri" w:cs="Calibri" w:eastAsia="Calibri" w:hAnsi="Calibri"/>
-                <w:sz w:val="17"/>
-                <w:szCs w:val="17"/>
-              </w:rPr>
-              <w:t xml:space="preserve">I/J</w:t>
-            </w:r>
-          </w:p>
-        </w:tc>
-        <w:tc>
-          <w:tcPr>
-            <w:tcW w:type="dxa" w:w="700"/>
-            <w:tcBorders>
-              <w:top w:val="single" w:color="999999" w:sz="2"/>
-              <w:left w:val="single" w:color="999999" w:sz="2"/>
-              <w:bottom w:val="single" w:color="999999" w:sz="2"/>
-              <w:right w:val="single" w:color="999999" w:sz="2"/>
-            </w:tcBorders>
-          </w:tcPr>
-          <w:p>
-            <w:r>
-              <w:rPr>
-                <w:rFonts w:ascii="Calibri" w:cs="Calibri" w:eastAsia="Calibri" w:hAnsi="Calibri"/>
-                <w:sz w:val="17"/>
-                <w:szCs w:val="17"/>
-              </w:rPr>
-              <w:t xml:space="preserve">K</w:t>
-            </w:r>
-          </w:p>
-        </w:tc>
-      </w:tr>
-      <w:tr>
-        <w:tc>
-          <w:tcPr>
-            <w:tcW w:type="dxa" w:w="500"/>
-            <w:tcBorders>
-              <w:top w:val="single" w:color="999999" w:sz="2"/>
-              <w:left w:val="single" w:color="999999" w:sz="2"/>
-              <w:bottom w:val="single" w:color="999999" w:sz="2"/>
-              <w:right w:val="single" w:color="999999" w:sz="2"/>
-            </w:tcBorders>
-          </w:tcPr>
-          <w:p>
-            <w:r>
-              <w:rPr>
-                <w:rFonts w:ascii="Calibri" w:cs="Calibri" w:eastAsia="Calibri" w:hAnsi="Calibri"/>
-                <w:sz w:val="17"/>
-                <w:szCs w:val="17"/>
-              </w:rPr>
-              <w:t xml:space="preserve">rang 4</w:t>
-            </w:r>
-          </w:p>
-        </w:tc>
-        <w:tc>
-          <w:tcPr>
-            <w:tcW w:type="dxa" w:w="700"/>
-            <w:tcBorders>
-              <w:top w:val="single" w:color="999999" w:sz="2"/>
-              <w:left w:val="single" w:color="999999" w:sz="2"/>
-              <w:bottom w:val="single" w:color="999999" w:sz="2"/>
-              <w:right w:val="single" w:color="999999" w:sz="2"/>
-            </w:tcBorders>
-          </w:tcPr>
-          <w:p>
-            <w:r>
-              <w:rPr>
-                <w:rFonts w:ascii="Calibri" w:cs="Calibri" w:eastAsia="Calibri" w:hAnsi="Calibri"/>
-                <w:sz w:val="17"/>
-                <w:szCs w:val="17"/>
-              </w:rPr>
-              <w:t xml:space="preserve">M</w:t>
-            </w:r>
-          </w:p>
-        </w:tc>
-        <w:tc>
-          <w:tcPr>
-            <w:tcW w:type="dxa" w:w="700"/>
-            <w:tcBorders>
-              <w:top w:val="single" w:color="999999" w:sz="2"/>
-              <w:left w:val="single" w:color="999999" w:sz="2"/>
-              <w:bottom w:val="single" w:color="999999" w:sz="2"/>
-              <w:right w:val="single" w:color="999999" w:sz="2"/>
-            </w:tcBorders>
-          </w:tcPr>
-          <w:p>
-            <w:r>
-              <w:rPr>
-                <w:rFonts w:ascii="Calibri" w:cs="Calibri" w:eastAsia="Calibri" w:hAnsi="Calibri"/>
-                <w:sz w:val="17"/>
-                <w:szCs w:val="17"/>
-              </w:rPr>
-              <w:t xml:space="preserve">N</w:t>
-            </w:r>
-          </w:p>
-        </w:tc>
-        <w:tc>
-          <w:tcPr>
-            <w:tcW w:type="dxa" w:w="700"/>
-            <w:tcBorders>
-              <w:top w:val="single" w:color="999999" w:sz="2"/>
-              <w:left w:val="single" w:color="999999" w:sz="2"/>
-              <w:bottom w:val="single" w:color="999999" w:sz="2"/>
-              <w:right w:val="single" w:color="999999" w:sz="2"/>
-            </w:tcBorders>
-          </w:tcPr>
-          <w:p>
-            <w:r>
-              <w:rPr>
-                <w:rFonts w:ascii="Calibri" w:cs="Calibri" w:eastAsia="Calibri" w:hAnsi="Calibri"/>
-                <w:sz w:val="17"/>
-                <w:szCs w:val="17"/>
-              </w:rPr>
-              <w:t xml:space="preserve">P</w:t>
-            </w:r>
-          </w:p>
-        </w:tc>
-        <w:tc>
-          <w:tcPr>
-            <w:tcW w:type="dxa" w:w="700"/>
-            <w:tcBorders>
-              <w:top w:val="single" w:color="999999" w:sz="2"/>
-              <w:left w:val="single" w:color="999999" w:sz="2"/>
-              <w:bottom w:val="single" w:color="999999" w:sz="2"/>
-              <w:right w:val="single" w:color="999999" w:sz="2"/>
-            </w:tcBorders>
-          </w:tcPr>
-          <w:p>
-            <w:r>
-              <w:rPr>
-                <w:rFonts w:ascii="Calibri" w:cs="Calibri" w:eastAsia="Calibri" w:hAnsi="Calibri"/>
-                <w:sz w:val="17"/>
-                <w:szCs w:val="17"/>
-              </w:rPr>
-              <w:t xml:space="preserve">Q</w:t>
-            </w:r>
-          </w:p>
-        </w:tc>
-        <w:tc>
-          <w:tcPr>
-            <w:tcW w:type="dxa" w:w="700"/>
-            <w:tcBorders>
-              <w:top w:val="single" w:color="999999" w:sz="2"/>
-              <w:left w:val="single" w:color="999999" w:sz="2"/>
-              <w:bottom w:val="single" w:color="999999" w:sz="2"/>
-              <w:right w:val="single" w:color="999999" w:sz="2"/>
-            </w:tcBorders>
-          </w:tcPr>
-          <w:p>
-            <w:r>
-              <w:rPr>
-                <w:rFonts w:ascii="Calibri" w:cs="Calibri" w:eastAsia="Calibri" w:hAnsi="Calibri"/>
-                <w:sz w:val="17"/>
-                <w:szCs w:val="17"/>
-              </w:rPr>
-              <w:t xml:space="preserve">R</w:t>
-            </w:r>
-          </w:p>
-        </w:tc>
-      </w:tr>
-    </w:tbl>
+    <w:p>
+      <w:pPr>
+        <w:spacing w:after="120"/>
+      </w:pPr>
+      <w:r>
+        <w:rPr>
+          <w:i/>
+          <w:iCs/>
+          <w:color w:val="666666"/>
+          <w:sz w:val="21"/>
+          <w:szCs w:val="21"/>
+        </w:rPr>
+        <w:t xml:space="preserve">Grille non reproduite ici — voir l’image du graffiti-grille (handout séparé, fourni avec la photo de la fresque).</w:t>
+      </w:r>
+    </w:p>
     <w:p>
       <w:pPr>
         <w:pStyle w:val="Heading2"/>
@@ -4307,7 +3643,7 @@
           <w:sz w:val="17"/>
           <w:szCs w:val="17"/>
         </w:rPr>
-        <w:t xml:space="preserve">En jeu, les joueurs ne font pas les calculs eux-mêmes : ils fournissent les paramètres à Bafouille (ou à l'outil bafouille.exe fourni par le MJ), qui produit les entrées en clair. C'est la résolution des énigmes qui est le jeu, pas la cryptographie.</w:t>
+        <w:t xml:space="preserve">En jeu, les joueurs ne font pas les calculs eux-mêmes : ils fournissent les paramètres à Bafouille, qui produit les entrées en clair. C'est la résolution des énigmes qui est le jeu, pas la cryptographie.</w:t>
       </w:r>
     </w:p>
     <w:p>

</xml_diff>